<commit_message>
risk factor qc, id fixes
</commit_message>
<xml_diff>
--- a/information/RU5389_Cognitive_FHS_Column_Reference(1).docx
+++ b/information/RU5389_Cognitive_FHS_Column_Reference(1).docx
@@ -549,14 +549,7 @@
                 <w:rFonts w:eastAsia="Calibri"/>
                 <w:sz w:val="18"/>
               </w:rPr>
-              <w:t xml:space="preserve">Excel sheet containing every original cognitive </w:t>
-            </w:r>
-            <w:r>
-              <w:rPr>
-                <w:rFonts w:eastAsia="Calibri"/>
-                <w:sz w:val="18"/>
-              </w:rPr>
-              <w:t>master column plus participant-level scores, statuses, and QC fields.</w:t>
+              <w:t>Excel sheet containing every original cognitive master column plus participant-level scores, statuses, and QC fields.</w:t>
             </w:r>
           </w:p>
         </w:tc>
@@ -666,14 +659,7 @@
                 <w:rFonts w:eastAsia="Calibri"/>
                 <w:sz w:val="18"/>
               </w:rPr>
-              <w:t xml:space="preserve">Excel sheet recording the input file, </w:t>
-            </w:r>
-            <w:r>
-              <w:rPr>
-                <w:rFonts w:eastAsia="Calibri"/>
-                <w:sz w:val="18"/>
-              </w:rPr>
-              <w:t>sample/project metadata, creation time, and active BACS exclusion/filter switches.</w:t>
+              <w:t>Excel sheet recording the input file, sample/project metadata, creation time, and active BACS exclusion/filter switches.</w:t>
             </w:r>
           </w:p>
         </w:tc>
@@ -930,14 +916,7 @@
                 <w:rFonts w:eastAsia="Calibri"/>
                 <w:sz w:val="18"/>
               </w:rPr>
-              <w:t xml:space="preserve">Sample parsed from the cognitive master </w:t>
-            </w:r>
-            <w:r>
-              <w:rPr>
-                <w:rFonts w:eastAsia="Calibri"/>
-                <w:sz w:val="18"/>
-              </w:rPr>
-              <w:t>filename, such as adults or adolescents.</w:t>
+              <w:t>Sample parsed from the cognitive master filename, such as adults or adolescents.</w:t>
             </w:r>
           </w:p>
         </w:tc>
@@ -1047,14 +1026,7 @@
                 <w:rFonts w:eastAsia="Calibri"/>
                 <w:sz w:val="18"/>
               </w:rPr>
-              <w:t xml:space="preserve">Processing status for that test file. </w:t>
-            </w:r>
-            <w:r>
-              <w:rPr>
-                <w:rFonts w:eastAsia="Calibri"/>
-                <w:sz w:val="18"/>
-              </w:rPr>
-              <w:t>Common failures indicate a missing file, empty/read error, incomplete format, or no scorable experiment trials.</w:t>
+              <w:t>Processing status for that test file. Common failures indicate a missing file, empty/read error, incomplete format, or no scorable experiment trials.</w:t>
             </w:r>
           </w:p>
         </w:tc>
@@ -1373,14 +1345,7 @@
                 <w:rFonts w:eastAsia="Calibri"/>
                 <w:sz w:val="18"/>
               </w:rPr>
-              <w:t xml:space="preserve">Number of non-training trials scored incorrect. Raw STATUS values 0 or 2 count as incorrect; lower is </w:t>
-            </w:r>
-            <w:r>
-              <w:rPr>
-                <w:rFonts w:eastAsia="Calibri"/>
-                <w:sz w:val="18"/>
-              </w:rPr>
-              <w:t>generally better.</w:t>
+              <w:t>Number of non-training trials scored incorrect. Raw STATUS values 0 or 2 count as incorrect; lower is generally better.</w:t>
             </w:r>
           </w:p>
         </w:tc>
@@ -1504,21 +1469,28 @@
                 <w:rFonts w:eastAsia="Calibri"/>
                 <w:sz w:val="18"/>
               </w:rPr>
-              <w:t xml:space="preserve"> time in milliseconds across all </w:t>
+              <w:t xml:space="preserve"> time</w:t>
             </w:r>
             <w:r>
               <w:rPr>
                 <w:rFonts w:eastAsia="Calibri"/>
                 <w:sz w:val="18"/>
               </w:rPr>
-              <w:t>retained experiment trials, both correct and incorrect. Higher means slower responding</w:t>
+              <w:t xml:space="preserve"> (entering of symbol + hitting enter)</w:t>
             </w:r>
             <w:r>
               <w:rPr>
                 <w:rFonts w:eastAsia="Calibri"/>
                 <w:sz w:val="18"/>
               </w:rPr>
-              <w:t>.</w:t>
+              <w:t xml:space="preserve"> in milliseconds across all retained experiment trials, both correct and incorrect. Higher means slower responding.</w:t>
+            </w:r>
+            <w:r>
+              <w:rPr>
+                <w:rFonts w:eastAsia="Calibri"/>
+                <w:sz w:val="18"/>
+              </w:rPr>
+              <w:t xml:space="preserve"> Has to be interpreted in conjunction with the accuracy</w:t>
             </w:r>
           </w:p>
         </w:tc>
@@ -1657,8 +1629,6 @@
                 <w:lang w:val="fr-FR"/>
               </w:rPr>
             </w:pPr>
-            <w:proofErr w:type="spellStart"/>
-            <w:proofErr w:type="gramStart"/>
             <w:r>
               <w:rPr>
                 <w:rFonts w:ascii="Consolas" w:eastAsia="Consolas" w:hAnsi="Consolas"/>
@@ -1666,19 +1636,8 @@
                 <w:sz w:val="16"/>
                 <w:lang w:val="fr-FR"/>
               </w:rPr>
-              <w:t>qc</w:t>
+              <w:t>qc_BACS_participant_rt_outlier</w:t>
             </w:r>
-            <w:proofErr w:type="gramEnd"/>
-            <w:r>
-              <w:rPr>
-                <w:rFonts w:ascii="Consolas" w:eastAsia="Consolas" w:hAnsi="Consolas"/>
-                <w:b/>
-                <w:sz w:val="16"/>
-                <w:lang w:val="fr-FR"/>
-              </w:rPr>
-              <w:t>_BACS_participant_rt_outlier</w:t>
-            </w:r>
-            <w:proofErr w:type="spellEnd"/>
           </w:p>
         </w:tc>
         <w:tc>
@@ -1756,14 +1715,7 @@
                 <w:rFonts w:eastAsia="Calibri"/>
                 <w:sz w:val="18"/>
               </w:rPr>
-              <w:t xml:space="preserve">Erfolgreich means scored. Erfolgreich; Trainingsflag means the training-error cutoff was exceeded but the configured </w:t>
-            </w:r>
-            <w:r>
-              <w:rPr>
-                <w:rFonts w:eastAsia="Calibri"/>
-                <w:sz w:val="18"/>
-              </w:rPr>
-              <w:t>exclusion is OFF. If participant RT exclusion is enabled, excluded rows receive NA scores.</w:t>
+              <w:t>Erfolgreich means scored. Erfolgreich; Trainingsflag means the training-error cutoff was exceeded but the configured exclusion is OFF. If participant RT exclusion is enabled, excluded rows receive NA scores.</w:t>
             </w:r>
           </w:p>
         </w:tc>
@@ -1787,13 +1739,7 @@
         <w:rPr>
           <w:rFonts w:eastAsia="Calibri"/>
         </w:rPr>
-        <w:t xml:space="preserve">The WCST outputs are raw 64-card task metrics. Correctness comes from anyerror. Perseverative errors are recomputed from the </w:t>
-      </w:r>
-      <w:r>
-        <w:rPr>
-          <w:rFonts w:eastAsia="Calibri"/>
-        </w:rPr>
-        <w:t>selected card and the active shape, number, or color principle; the task file's precomputed perseveration fields are not used.</w:t>
+        <w:t>The WCST outputs are raw 64-card task metrics. Correctness comes from anyerror. Perseverative errors are recomputed from the selected card and the active shape, number, or color principle; the task file's precomputed perseveration fields are not used.</w:t>
       </w:r>
     </w:p>
     <w:tbl>
@@ -2253,14 +2199,7 @@
                 <w:rFonts w:eastAsia="Calibri"/>
                 <w:sz w:val="18"/>
               </w:rPr>
-              <w:t xml:space="preserve">Count of occasions where a run had reached 5-9 consecutive correct responses and then reset to 0 </w:t>
-            </w:r>
-            <w:r>
-              <w:rPr>
-                <w:rFonts w:eastAsia="Calibri"/>
-                <w:sz w:val="18"/>
-              </w:rPr>
-              <w:t>before category completion. Lower is better.</w:t>
+              <w:t>Count of occasions where a run had reached 5-9 consecutive correct responses and then reset to 0 before category completion. Lower is better.</w:t>
             </w:r>
           </w:p>
         </w:tc>
@@ -2580,14 +2519,7 @@
                 <w:rFonts w:eastAsia="Calibri"/>
                 <w:sz w:val="18"/>
               </w:rPr>
-              <w:t xml:space="preserve">Count of scored experiment trials with seq_correct = 1. </w:t>
-            </w:r>
-            <w:r>
-              <w:rPr>
-                <w:rFonts w:eastAsia="Calibri"/>
-                <w:sz w:val="18"/>
-              </w:rPr>
-              <w:t>Higher is better.</w:t>
+              <w:t>Count of scored experiment trials with seq_correct = 1. Higher is better.</w:t>
             </w:r>
           </w:p>
         </w:tc>
@@ -2697,14 +2629,7 @@
                 <w:rFonts w:eastAsia="Calibri"/>
                 <w:sz w:val="18"/>
               </w:rPr>
-              <w:t xml:space="preserve">Longest correctly answered sequence, measured by the number of characters in itemCorrect. This assumes one encoded </w:t>
-            </w:r>
-            <w:r>
-              <w:rPr>
-                <w:rFonts w:eastAsia="Calibri"/>
-                <w:sz w:val="18"/>
-              </w:rPr>
-              <w:t>character per item and should be rechecked if task encoding changes.</w:t>
+              <w:t>Longest correctly answered sequence, measured by the number of characters in itemCorrect. This assumes one encoded character per item and should be rechecked if task encoding changes.</w:t>
             </w:r>
           </w:p>
         </w:tc>
@@ -2913,10 +2838,7 @@
         <w:pStyle w:val="berschrift1"/>
       </w:pPr>
       <w:r>
-        <w:t xml:space="preserve">Family </w:t>
-      </w:r>
-      <w:r>
-        <w:t>History Screen (FHS)</w:t>
+        <w:t>Family History Screen (FHS)</w:t>
       </w:r>
     </w:p>
     <w:p>
@@ -3173,14 +3095,7 @@
                 <w:rFonts w:eastAsia="Calibri"/>
                 <w:sz w:val="18"/>
               </w:rPr>
-              <w:t xml:space="preserve">Moderately </w:t>
-            </w:r>
-            <w:r>
-              <w:rPr>
-                <w:rFonts w:eastAsia="Calibri"/>
-                <w:sz w:val="18"/>
-              </w:rPr>
-              <w:t>certain: clear indication but no confirmed diagnosis.</w:t>
+              <w:t>Moderately certain: clear indication but no confirmed diagnosis.</w:t>
             </w:r>
           </w:p>
         </w:tc>
@@ -3451,14 +3366,7 @@
                 <w:rFonts w:eastAsia="Calibri"/>
                 <w:sz w:val="18"/>
               </w:rPr>
-              <w:t xml:space="preserve">TRUE when at least one source FHS field contains a value. FALSE rows are </w:t>
-            </w:r>
-            <w:r>
-              <w:rPr>
-                <w:rFonts w:eastAsia="Calibri"/>
-                <w:sz w:val="18"/>
-              </w:rPr>
-              <w:t>retained, but their derived FHS values are NA.</w:t>
+              <w:t>TRUE when at least one source FHS field contains a value. FALSE rows are retained, but their derived FHS values are NA.</w:t>
             </w:r>
           </w:p>
         </w:tc>
@@ -3568,14 +3476,7 @@
                 <w:rFonts w:eastAsia="Calibri"/>
                 <w:sz w:val="18"/>
               </w:rPr>
-              <w:t xml:space="preserve">TRUE when FHSOpenText is non-empty. The text is flagged for manual </w:t>
-            </w:r>
-            <w:r>
-              <w:rPr>
-                <w:rFonts w:eastAsia="Calibri"/>
-                <w:sz w:val="18"/>
-              </w:rPr>
-              <w:t>review and is not automatically converted into a diagnosis.</w:t>
+              <w:t>TRUE when FHSOpenText is non-empty. The text is flagged for manual review and is not automatically converted into a diagnosis.</w:t>
             </w:r>
           </w:p>
         </w:tc>
@@ -3795,14 +3696,7 @@
                 <w:rFonts w:eastAsia="Calibri"/>
                 <w:sz w:val="18"/>
               </w:rPr>
-              <w:t xml:space="preserve">Comma-separated diagnosis </w:t>
-            </w:r>
-            <w:r>
-              <w:rPr>
-                <w:rFonts w:eastAsia="Calibri"/>
-                <w:sz w:val="18"/>
-              </w:rPr>
-              <w:t>tokens whose self confidence is at or above the cutoff; nodiagn means the FHS was answered but no self category met the cutoff.</w:t>
+              <w:t>Comma-separated diagnosis tokens whose self confidence is at or above the cutoff; nodiagn means the FHS was answered but no self category met the cutoff.</w:t>
             </w:r>
           </w:p>
         </w:tc>
@@ -4188,14 +4082,7 @@
                 <w:rFonts w:eastAsia="Calibri"/>
                 <w:sz w:val="18"/>
               </w:rPr>
-              <w:t xml:space="preserve">Denominator used for family-history proportions: reported siblings + reported </w:t>
-            </w:r>
-            <w:r>
-              <w:rPr>
-                <w:rFonts w:eastAsia="Calibri"/>
-                <w:sz w:val="18"/>
-              </w:rPr>
-              <w:t>children + 2 parents. Spouses and second-degree relatives are not included.</w:t>
+              <w:t>Denominator used for family-history proportions: reported siblings + reported children + 2 parents. Spouses and second-degree relatives are not included.</w:t>
             </w:r>
           </w:p>
         </w:tc>
@@ -4616,14 +4503,7 @@
                 <w:rFonts w:eastAsia="Calibri"/>
                 <w:sz w:val="18"/>
               </w:rPr>
-              <w:t xml:space="preserve">Sanitized prefix of the source confidence field. The exact set is version-dependent and comes from </w:t>
-            </w:r>
-            <w:r>
-              <w:rPr>
-                <w:rFonts w:eastAsia="Calibri"/>
-                <w:sz w:val="18"/>
-              </w:rPr>
-              <w:t>Item Information/current raw columns.</w:t>
+              <w:t>Sanitized prefix of the source confidence field. The exact set is version-dependent and comes from Item Information/current raw columns.</w:t>
             </w:r>
           </w:p>
         </w:tc>
@@ -4843,14 +4723,7 @@
                 <w:rFonts w:eastAsia="Calibri"/>
                 <w:sz w:val="18"/>
               </w:rPr>
-              <w:t xml:space="preserve">Not available or not applicable. For FHS this may mean no FHS response, a non-existing </w:t>
-            </w:r>
-            <w:r>
-              <w:rPr>
-                <w:rFonts w:eastAsia="Calibri"/>
-                <w:sz w:val="18"/>
-              </w:rPr>
-              <w:t>sibling/child slot, a missing denominator, or an uncomputable field.</w:t>
+              <w:t>Not available or not applicable. For FHS this may mean no FHS response, a non-existing sibling/child slot, a missing denominator, or an uncomputable field.</w:t>
             </w:r>
           </w:p>
         </w:tc>
@@ -4890,16 +4763,7 @@
         <w:pStyle w:val="Aufzhlungszeichen"/>
       </w:pPr>
       <w:r>
-        <w:t xml:space="preserve">Reviewed </w:t>
-      </w:r>
-      <w:r>
-        <w:t xml:space="preserve">free-text corrections </w:t>
-      </w:r>
-      <w:r>
-        <w:t xml:space="preserve">are applied only when the </w:t>
-      </w:r>
-      <w:r>
-        <w:t>configured switch is TRUE and both participant ID and target column exist. New free text is flagged, not auto-scored.</w:t>
+        <w:t>Reviewed free-text corrections are applied only when the configured switch is TRUE and both participant ID and target column exist. New free text is flagged, not auto-scored.</w:t>
       </w:r>
     </w:p>
     <w:p>

</xml_diff>